<commit_message>
Refactor booking system with references and database
[+] Added SQLite database table for customer booking details.

[+] Added generate_booking_reference() to create a unique 8-character alphanumeric reference.

[+] Added functions to save and delete booking details from the database.

[*] Refactored book_seat() so a booking reference is stored in the seat map instead of R.

[*] Refactored free_seat() so freeing a seat changes it back to F and removes customer details from the database.

[*] Updated show_booking_status() so booked seats are counted by booking reference.
</commit_message>
<xml_diff>
--- a/FC723 Project - Documentation/Project report.docx
+++ b/FC723 Project - Documentation/Project report.docx
@@ -219,114 +219,82 @@
           <w:szCs w:val="18"/>
         </w:rPr>
       </w:pPr>
-    </w:p>
-    <w:p>
-      <w:pPr>
-        <w:rPr>
-          <w:rFonts w:ascii="Arial" w:hAnsi="Arial" w:cs="Arial"/>
-          <w:sz w:val="18"/>
-          <w:szCs w:val="18"/>
-        </w:rPr>
-      </w:pPr>
-    </w:p>
-    <w:p>
-      <w:pPr>
-        <w:rPr>
-          <w:rFonts w:ascii="Arial" w:hAnsi="Arial" w:cs="Arial"/>
-          <w:sz w:val="18"/>
-          <w:szCs w:val="18"/>
-        </w:rPr>
-      </w:pPr>
-    </w:p>
-    <w:p>
-      <w:pPr>
-        <w:rPr>
-          <w:rFonts w:ascii="Arial" w:hAnsi="Arial" w:cs="Arial"/>
-          <w:sz w:val="18"/>
-          <w:szCs w:val="18"/>
-        </w:rPr>
-      </w:pPr>
-    </w:p>
-    <w:p>
-      <w:pPr>
-        <w:rPr>
-          <w:rFonts w:ascii="Arial" w:hAnsi="Arial" w:cs="Arial"/>
-          <w:sz w:val="18"/>
-          <w:szCs w:val="18"/>
-        </w:rPr>
-      </w:pPr>
-    </w:p>
-    <w:p>
-      <w:pPr>
-        <w:rPr>
-          <w:rFonts w:ascii="Arial" w:hAnsi="Arial" w:cs="Arial"/>
-          <w:sz w:val="18"/>
-          <w:szCs w:val="18"/>
-        </w:rPr>
-      </w:pPr>
-    </w:p>
-    <w:p>
-      <w:pPr>
-        <w:rPr>
-          <w:rFonts w:ascii="Arial" w:hAnsi="Arial" w:cs="Arial"/>
-          <w:sz w:val="18"/>
-          <w:szCs w:val="18"/>
-        </w:rPr>
-      </w:pPr>
-    </w:p>
-    <w:p>
-      <w:pPr>
-        <w:rPr>
-          <w:rFonts w:ascii="Arial" w:hAnsi="Arial" w:cs="Arial"/>
-          <w:sz w:val="18"/>
-          <w:szCs w:val="18"/>
-        </w:rPr>
-      </w:pPr>
-    </w:p>
-    <w:p>
-      <w:pPr>
-        <w:rPr>
-          <w:rFonts w:ascii="Arial" w:hAnsi="Arial" w:cs="Arial"/>
-          <w:sz w:val="18"/>
-          <w:szCs w:val="18"/>
-        </w:rPr>
-      </w:pPr>
-    </w:p>
-    <w:p>
-      <w:pPr>
-        <w:rPr>
-          <w:rFonts w:ascii="Arial" w:hAnsi="Arial" w:cs="Arial"/>
-          <w:sz w:val="18"/>
-          <w:szCs w:val="18"/>
-        </w:rPr>
-      </w:pPr>
-    </w:p>
-    <w:p>
-      <w:pPr>
-        <w:rPr>
-          <w:rFonts w:ascii="Arial" w:hAnsi="Arial" w:cs="Arial"/>
-          <w:sz w:val="18"/>
-          <w:szCs w:val="18"/>
-        </w:rPr>
-      </w:pPr>
-    </w:p>
-    <w:p>
-      <w:pPr>
-        <w:rPr>
-          <w:rFonts w:ascii="Arial" w:hAnsi="Arial" w:cs="Arial"/>
-          <w:sz w:val="18"/>
-          <w:szCs w:val="18"/>
-        </w:rPr>
-      </w:pPr>
-    </w:p>
-    <w:p>
-      <w:pPr>
-        <w:rPr>
-          <w:rFonts w:ascii="Arial" w:hAnsi="Arial" w:cs="Arial"/>
-          <w:sz w:val="18"/>
-          <w:szCs w:val="18"/>
-        </w:rPr>
-      </w:pPr>
+      <w:r>
+        <w:rPr>
+          <w:rFonts w:ascii="Arial" w:hAnsi="Arial" w:cs="Arial"/>
+          <w:sz w:val="18"/>
+          <w:szCs w:val="18"/>
+        </w:rPr>
+        <w:t>For this project, I chose the iterative software development process. This means the system is developed in small stages instead of trying to complete the whole system at once. I chose this process because the project brief has more than one part. Part A starts with a basic seat booking system, and Part B later adds booking references and database storage.</w:t>
+      </w:r>
+    </w:p>
+    <w:p>
+      <w:pPr>
+        <w:rPr>
+          <w:rFonts w:ascii="Arial" w:hAnsi="Arial" w:cs="Arial"/>
+          <w:sz w:val="18"/>
+          <w:szCs w:val="18"/>
+        </w:rPr>
+      </w:pPr>
+      <w:r>
+        <w:rPr>
+          <w:rFonts w:ascii="Arial" w:hAnsi="Arial" w:cs="Arial"/>
+          <w:sz w:val="18"/>
+          <w:szCs w:val="18"/>
+        </w:rPr>
+        <w:t>The first reason for choosing the iterative process is that it makes the project easier to manage. I can first build the basic menu and seat booking functions, then test them before adding more advanced features. This reduces the chance of building a large program with many errors.</w:t>
+      </w:r>
+    </w:p>
+    <w:p>
+      <w:pPr>
+        <w:rPr>
+          <w:rFonts w:ascii="Arial" w:hAnsi="Arial" w:cs="Arial"/>
+          <w:sz w:val="18"/>
+          <w:szCs w:val="18"/>
+        </w:rPr>
+      </w:pPr>
+      <w:r>
+        <w:rPr>
+          <w:rFonts w:ascii="Arial" w:hAnsi="Arial" w:cs="Arial"/>
+          <w:sz w:val="18"/>
+          <w:szCs w:val="18"/>
+        </w:rPr>
+        <w:t>The second reason is that the requirements change later in the project. In Part B, Apache Airlines adds new requirements such as customer details, passport numbers, booking references, and database storage. An iterative process is useful here because the existing code can be improved and refactored instead of being completely rewritten.</w:t>
+      </w:r>
+    </w:p>
+    <w:p>
+      <w:pPr>
+        <w:rPr>
+          <w:rFonts w:ascii="Arial" w:hAnsi="Arial" w:cs="Arial"/>
+          <w:sz w:val="18"/>
+          <w:szCs w:val="18"/>
+        </w:rPr>
+      </w:pPr>
+      <w:r>
+        <w:rPr>
+          <w:rFonts w:ascii="Arial" w:hAnsi="Arial" w:cs="Arial"/>
+          <w:sz w:val="18"/>
+          <w:szCs w:val="18"/>
+        </w:rPr>
+        <w:t>The third reason is that it supports testing after each stage. For example, after creating the Part A version, I tested checking availability, booking seats, freeing seats, showing the booking status, and preventing bookings on storage spaces. After the extra feature was added, I tested whether the program could find the first available seat in a selected row.</w:t>
+      </w:r>
+    </w:p>
+    <w:p>
+      <w:pPr>
+        <w:rPr>
+          <w:rFonts w:ascii="Arial" w:hAnsi="Arial" w:cs="Arial"/>
+          <w:sz w:val="18"/>
+          <w:szCs w:val="18"/>
+        </w:rPr>
+      </w:pPr>
+      <w:r>
+        <w:rPr>
+          <w:rFonts w:ascii="Arial" w:hAnsi="Arial" w:cs="Arial"/>
+          <w:sz w:val="18"/>
+          <w:szCs w:val="18"/>
+        </w:rPr>
+        <w:t>Overall, the iterative process is suitable for this project because the system starts simple and becomes more advanced over time. It also helps me improve the code gradually while keeping each part easier to understand and explain.</w:t>
+      </w:r>
     </w:p>
     <w:p>
       <w:pPr>
@@ -415,10 +383,10 @@
           <w:szCs w:val="18"/>
         </w:rPr>
         <w:drawing>
-          <wp:inline distT="0" distB="0" distL="0" distR="0" wp14:anchorId="653D585C" wp14:editId="1F92A577">
-            <wp:extent cx="5824330" cy="4655596"/>
-            <wp:effectExtent l="0" t="0" r="5080" b="0"/>
-            <wp:docPr id="1709775353" name="Picture 1"/>
+          <wp:inline distT="0" distB="0" distL="0" distR="0" wp14:anchorId="53CBFF73" wp14:editId="11E9E2A2">
+            <wp:extent cx="5943600" cy="3816985"/>
+            <wp:effectExtent l="0" t="0" r="0" b="0"/>
+            <wp:docPr id="696715957" name="Picture 1"/>
             <wp:cNvGraphicFramePr>
               <a:graphicFrameLocks xmlns:a="http://schemas.openxmlformats.org/drawingml/2006/main" noChangeAspect="1"/>
             </wp:cNvGraphicFramePr>
@@ -426,7 +394,7 @@
               <a:graphicData uri="http://schemas.openxmlformats.org/drawingml/2006/picture">
                 <pic:pic xmlns:pic="http://schemas.openxmlformats.org/drawingml/2006/picture">
                   <pic:nvPicPr>
-                    <pic:cNvPr id="1709775353" name=""/>
+                    <pic:cNvPr id="696715957" name=""/>
                     <pic:cNvPicPr/>
                   </pic:nvPicPr>
                   <pic:blipFill>
@@ -438,7 +406,7 @@
                   <pic:spPr>
                     <a:xfrm>
                       <a:off x="0" y="0"/>
-                      <a:ext cx="5963777" cy="4767061"/>
+                      <a:ext cx="5943600" cy="3816985"/>
                     </a:xfrm>
                     <a:prstGeom prst="rect">
                       <a:avLst/>
@@ -483,7 +451,51 @@
           <w:sz w:val="18"/>
           <w:szCs w:val="18"/>
         </w:rPr>
-        <w:t xml:space="preserve"> seat map and then displays the main menu. The user can choose to check seat availability, book a seat, free a seat, show the booking status, or exit. After each action, the system returns to the main menu unless the user chooses the exit option.</w:t>
+        <w:t xml:space="preserve"> seat map and then displays the main menu</w:t>
+      </w:r>
+      <w:r>
+        <w:rPr>
+          <w:rFonts w:ascii="Arial" w:hAnsi="Arial" w:cs="Arial"/>
+          <w:sz w:val="18"/>
+          <w:szCs w:val="18"/>
+        </w:rPr>
+        <w:t xml:space="preserve">. </w:t>
+      </w:r>
+      <w:r>
+        <w:rPr>
+          <w:rFonts w:ascii="Arial" w:hAnsi="Arial" w:cs="Arial"/>
+          <w:sz w:val="18"/>
+          <w:szCs w:val="18"/>
+        </w:rPr>
+        <w:t xml:space="preserve">The user can choose to check seat availability, book a seat, free a seat, show the booking status, find the first available seat by row, or </w:t>
+      </w:r>
+      <w:proofErr w:type="spellStart"/>
+      <w:proofErr w:type="gramStart"/>
+      <w:r>
+        <w:rPr>
+          <w:rFonts w:ascii="Arial" w:hAnsi="Arial" w:cs="Arial"/>
+          <w:sz w:val="18"/>
+          <w:szCs w:val="18"/>
+        </w:rPr>
+        <w:t>exit.</w:t>
+      </w:r>
+      <w:r>
+        <w:rPr>
+          <w:rFonts w:ascii="Arial" w:hAnsi="Arial" w:cs="Arial"/>
+          <w:sz w:val="18"/>
+          <w:szCs w:val="18"/>
+        </w:rPr>
+        <w:t>show</w:t>
+      </w:r>
+      <w:proofErr w:type="spellEnd"/>
+      <w:proofErr w:type="gramEnd"/>
+      <w:r>
+        <w:rPr>
+          <w:rFonts w:ascii="Arial" w:hAnsi="Arial" w:cs="Arial"/>
+          <w:sz w:val="18"/>
+          <w:szCs w:val="18"/>
+        </w:rPr>
+        <w:t xml:space="preserve"> the booking status, or exit. After each action, the system returns to the main menu unless the user chooses the exit option.</w:t>
       </w:r>
     </w:p>
     <w:p>
@@ -511,15 +523,202 @@
         </w:rPr>
         <w:br/>
       </w:r>
-      <w:r>
-        <w:rPr>
-          <w:rFonts w:ascii="Arial" w:hAnsi="Arial" w:cs="Arial"/>
-          <w:sz w:val="18"/>
-          <w:szCs w:val="18"/>
-        </w:rPr>
+    </w:p>
+    <w:p>
+      <w:pPr>
+        <w:rPr>
+          <w:rFonts w:ascii="Arial" w:hAnsi="Arial" w:cs="Arial"/>
+          <w:sz w:val="18"/>
+          <w:szCs w:val="18"/>
+        </w:rPr>
+      </w:pPr>
+    </w:p>
+    <w:p>
+      <w:pPr>
+        <w:rPr>
+          <w:rFonts w:ascii="Arial" w:hAnsi="Arial" w:cs="Arial"/>
+          <w:sz w:val="18"/>
+          <w:szCs w:val="18"/>
+        </w:rPr>
+      </w:pPr>
+    </w:p>
+    <w:p>
+      <w:pPr>
+        <w:rPr>
+          <w:rFonts w:ascii="Arial" w:hAnsi="Arial" w:cs="Arial"/>
+          <w:sz w:val="18"/>
+          <w:szCs w:val="18"/>
+        </w:rPr>
+      </w:pPr>
+    </w:p>
+    <w:p>
+      <w:pPr>
+        <w:rPr>
+          <w:rFonts w:ascii="Arial" w:hAnsi="Arial" w:cs="Arial"/>
+          <w:sz w:val="18"/>
+          <w:szCs w:val="18"/>
+        </w:rPr>
+      </w:pPr>
+    </w:p>
+    <w:p>
+      <w:pPr>
+        <w:rPr>
+          <w:rFonts w:ascii="Arial" w:hAnsi="Arial" w:cs="Arial"/>
+          <w:sz w:val="18"/>
+          <w:szCs w:val="18"/>
+        </w:rPr>
+      </w:pPr>
+    </w:p>
+    <w:p>
+      <w:pPr>
+        <w:rPr>
+          <w:rFonts w:ascii="Arial" w:hAnsi="Arial" w:cs="Arial"/>
+          <w:sz w:val="18"/>
+          <w:szCs w:val="18"/>
+        </w:rPr>
+      </w:pPr>
+    </w:p>
+    <w:p>
+      <w:pPr>
+        <w:rPr>
+          <w:rFonts w:ascii="Arial" w:hAnsi="Arial" w:cs="Arial"/>
+          <w:sz w:val="18"/>
+          <w:szCs w:val="18"/>
+        </w:rPr>
+      </w:pPr>
+    </w:p>
+    <w:p>
+      <w:pPr>
+        <w:rPr>
+          <w:rFonts w:ascii="Arial" w:hAnsi="Arial" w:cs="Arial"/>
+          <w:sz w:val="18"/>
+          <w:szCs w:val="18"/>
+        </w:rPr>
+      </w:pPr>
+    </w:p>
+    <w:p>
+      <w:pPr>
+        <w:rPr>
+          <w:rFonts w:ascii="Arial" w:hAnsi="Arial" w:cs="Arial"/>
+          <w:b/>
+          <w:bCs/>
+        </w:rPr>
+      </w:pPr>
+      <w:r>
+        <w:rPr>
+          <w:rFonts w:ascii="Arial" w:hAnsi="Arial" w:cs="Arial"/>
+          <w:b/>
+          <w:bCs/>
+        </w:rPr>
+        <w:lastRenderedPageBreak/>
         <w:br/>
         <w:t>Part A Q5: Additional Airline Functionality</w:t>
       </w:r>
+    </w:p>
+    <w:p>
+      <w:pPr>
+        <w:rPr>
+          <w:rFonts w:ascii="Arial" w:hAnsi="Arial" w:cs="Arial"/>
+          <w:sz w:val="18"/>
+          <w:szCs w:val="18"/>
+        </w:rPr>
+      </w:pPr>
+      <w:r>
+        <w:rPr>
+          <w:rFonts w:ascii="Arial" w:hAnsi="Arial" w:cs="Arial"/>
+          <w:sz w:val="18"/>
+          <w:szCs w:val="18"/>
+        </w:rPr>
+        <w:t>The additional functionality I implemented is a feature that finds the first available seat in a selected row. This is useful in an airline booking system because it helps the user quickly find a free seat without manually checking the full seating layout.</w:t>
+      </w:r>
+    </w:p>
+    <w:p>
+      <w:pPr>
+        <w:rPr>
+          <w:rFonts w:ascii="Arial" w:hAnsi="Arial" w:cs="Arial"/>
+          <w:sz w:val="18"/>
+          <w:szCs w:val="18"/>
+        </w:rPr>
+      </w:pPr>
+    </w:p>
+    <w:p>
+      <w:pPr>
+        <w:rPr>
+          <w:rFonts w:ascii="Arial" w:hAnsi="Arial" w:cs="Arial"/>
+          <w:sz w:val="18"/>
+          <w:szCs w:val="18"/>
+        </w:rPr>
+      </w:pPr>
+      <w:r>
+        <w:rPr>
+          <w:rFonts w:ascii="Arial" w:hAnsi="Arial" w:cs="Arial"/>
+          <w:sz w:val="18"/>
+          <w:szCs w:val="18"/>
+        </w:rPr>
+        <w:t>The user enters a preferred row from A to F. The program then searches through the seat numbers in that row. If it finds a seat marked as F, it displays that seat code to the user. If there are no free seats in the selected row, the program displays a message explaining that no seats are available in that row.</w:t>
+      </w:r>
+    </w:p>
+    <w:p>
+      <w:pPr>
+        <w:rPr>
+          <w:rFonts w:ascii="Arial" w:hAnsi="Arial" w:cs="Arial"/>
+          <w:sz w:val="18"/>
+          <w:szCs w:val="18"/>
+        </w:rPr>
+      </w:pPr>
+    </w:p>
+    <w:p>
+      <w:pPr>
+        <w:rPr>
+          <w:rFonts w:ascii="Arial" w:hAnsi="Arial" w:cs="Arial"/>
+          <w:sz w:val="18"/>
+          <w:szCs w:val="18"/>
+        </w:rPr>
+      </w:pPr>
+      <w:r>
+        <w:rPr>
+          <w:rFonts w:ascii="Arial" w:hAnsi="Arial" w:cs="Arial"/>
+          <w:sz w:val="18"/>
+          <w:szCs w:val="18"/>
+        </w:rPr>
+        <w:t xml:space="preserve">This feature is implemented in the function </w:t>
+      </w:r>
+      <w:proofErr w:type="spellStart"/>
+      <w:r>
+        <w:rPr>
+          <w:rFonts w:ascii="Arial" w:hAnsi="Arial" w:cs="Arial"/>
+          <w:sz w:val="18"/>
+          <w:szCs w:val="18"/>
+        </w:rPr>
+        <w:t>find_available_seat_by_</w:t>
+      </w:r>
+      <w:proofErr w:type="gramStart"/>
+      <w:r>
+        <w:rPr>
+          <w:rFonts w:ascii="Arial" w:hAnsi="Arial" w:cs="Arial"/>
+          <w:sz w:val="18"/>
+          <w:szCs w:val="18"/>
+        </w:rPr>
+        <w:t>row</w:t>
+      </w:r>
+      <w:proofErr w:type="spellEnd"/>
+      <w:r>
+        <w:rPr>
+          <w:rFonts w:ascii="Arial" w:hAnsi="Arial" w:cs="Arial"/>
+          <w:sz w:val="18"/>
+          <w:szCs w:val="18"/>
+        </w:rPr>
+        <w:t>(</w:t>
+      </w:r>
+      <w:proofErr w:type="gramEnd"/>
+      <w:r>
+        <w:rPr>
+          <w:rFonts w:ascii="Arial" w:hAnsi="Arial" w:cs="Arial"/>
+          <w:sz w:val="18"/>
+          <w:szCs w:val="18"/>
+        </w:rPr>
+        <w:t>). It uses a loop to check the seats in order from 1 to 80 and stops when the first free seat is found.</w:t>
+      </w:r>
       <w:r>
         <w:rPr>
           <w:rFonts w:ascii="Arial" w:hAnsi="Arial" w:cs="Arial"/>
@@ -528,15 +727,266 @@
         </w:rPr>
         <w:br/>
       </w:r>
-      <w:r>
-        <w:rPr>
-          <w:rFonts w:ascii="Arial" w:hAnsi="Arial" w:cs="Arial"/>
-          <w:sz w:val="18"/>
-          <w:szCs w:val="18"/>
+    </w:p>
+    <w:p>
+      <w:pPr>
+        <w:rPr>
+          <w:rFonts w:ascii="Arial" w:hAnsi="Arial" w:cs="Arial"/>
+          <w:sz w:val="18"/>
+          <w:szCs w:val="18"/>
+        </w:rPr>
+      </w:pPr>
+    </w:p>
+    <w:p>
+      <w:pPr>
+        <w:rPr>
+          <w:rFonts w:ascii="Arial" w:hAnsi="Arial" w:cs="Arial"/>
+          <w:sz w:val="18"/>
+          <w:szCs w:val="18"/>
+        </w:rPr>
+      </w:pPr>
+    </w:p>
+    <w:p>
+      <w:pPr>
+        <w:rPr>
+          <w:rFonts w:ascii="Arial" w:hAnsi="Arial" w:cs="Arial"/>
+          <w:sz w:val="18"/>
+          <w:szCs w:val="18"/>
+        </w:rPr>
+      </w:pPr>
+    </w:p>
+    <w:p>
+      <w:pPr>
+        <w:rPr>
+          <w:rFonts w:ascii="Arial" w:hAnsi="Arial" w:cs="Arial"/>
+          <w:sz w:val="18"/>
+          <w:szCs w:val="18"/>
+        </w:rPr>
+      </w:pPr>
+    </w:p>
+    <w:p>
+      <w:pPr>
+        <w:rPr>
+          <w:rFonts w:ascii="Arial" w:hAnsi="Arial" w:cs="Arial"/>
+          <w:sz w:val="18"/>
+          <w:szCs w:val="18"/>
+        </w:rPr>
+      </w:pPr>
+    </w:p>
+    <w:p>
+      <w:pPr>
+        <w:rPr>
+          <w:rFonts w:ascii="Arial" w:hAnsi="Arial" w:cs="Arial"/>
+          <w:sz w:val="18"/>
+          <w:szCs w:val="18"/>
+        </w:rPr>
+      </w:pPr>
+    </w:p>
+    <w:p>
+      <w:pPr>
+        <w:rPr>
+          <w:rFonts w:ascii="Arial" w:hAnsi="Arial" w:cs="Arial"/>
+          <w:sz w:val="18"/>
+          <w:szCs w:val="18"/>
+        </w:rPr>
+      </w:pPr>
+    </w:p>
+    <w:p>
+      <w:pPr>
+        <w:rPr>
+          <w:rFonts w:ascii="Arial" w:hAnsi="Arial" w:cs="Arial"/>
+          <w:sz w:val="18"/>
+          <w:szCs w:val="18"/>
+        </w:rPr>
+      </w:pPr>
+    </w:p>
+    <w:p>
+      <w:pPr>
+        <w:rPr>
+          <w:rFonts w:ascii="Arial" w:hAnsi="Arial" w:cs="Arial"/>
+          <w:sz w:val="18"/>
+          <w:szCs w:val="18"/>
+        </w:rPr>
+      </w:pPr>
+    </w:p>
+    <w:p>
+      <w:pPr>
+        <w:rPr>
+          <w:rFonts w:ascii="Arial" w:hAnsi="Arial" w:cs="Arial"/>
+          <w:b/>
+          <w:bCs/>
+        </w:rPr>
+      </w:pPr>
+      <w:r>
+        <w:rPr>
+          <w:rFonts w:ascii="Arial" w:hAnsi="Arial" w:cs="Arial"/>
+          <w:b/>
+          <w:bCs/>
         </w:rPr>
         <w:br/>
         <w:t>Part A Q6: GitHub Version Control</w:t>
       </w:r>
+    </w:p>
+    <w:p>
+      <w:pPr>
+        <w:rPr>
+          <w:rFonts w:ascii="Arial" w:hAnsi="Arial" w:cs="Arial"/>
+          <w:sz w:val="18"/>
+          <w:szCs w:val="18"/>
+        </w:rPr>
+      </w:pPr>
+      <w:r>
+        <w:rPr>
+          <w:rFonts w:ascii="Arial" w:hAnsi="Arial" w:cs="Arial"/>
+          <w:sz w:val="18"/>
+          <w:szCs w:val="18"/>
+        </w:rPr>
+        <w:t>To maintain version control, I created a public GitHub repository for the Apache Airlines seat booking system. I used GitHub Desktop because it provides a simple way to track changes, commit files, and push the project to GitHub.</w:t>
+      </w:r>
+    </w:p>
+    <w:p>
+      <w:pPr>
+        <w:rPr>
+          <w:rFonts w:ascii="Arial" w:hAnsi="Arial" w:cs="Arial"/>
+          <w:sz w:val="18"/>
+          <w:szCs w:val="18"/>
+        </w:rPr>
+      </w:pPr>
+      <w:r>
+        <w:rPr>
+          <w:rFonts w:ascii="Arial" w:hAnsi="Arial" w:cs="Arial"/>
+          <w:sz w:val="18"/>
+          <w:szCs w:val="18"/>
+        </w:rPr>
+        <w:t>First, I created the project folder with two main folders: FC723 Project - Application for the Python code and FC723 Project - Documentation for the written documents and diagrams. Then I opened GitHub Desktop and created a new repository using the project folder as the local repository.</w:t>
+      </w:r>
+    </w:p>
+    <w:p>
+      <w:pPr>
+        <w:rPr>
+          <w:rFonts w:ascii="Arial" w:hAnsi="Arial" w:cs="Arial"/>
+          <w:sz w:val="18"/>
+          <w:szCs w:val="18"/>
+        </w:rPr>
+      </w:pPr>
+      <w:r>
+        <w:rPr>
+          <w:rFonts w:ascii="Arial" w:hAnsi="Arial" w:cs="Arial"/>
+          <w:sz w:val="18"/>
+          <w:szCs w:val="18"/>
+        </w:rPr>
+        <w:t xml:space="preserve">After writing the first working version of main.py, I made a commit with the message Add Part A seat booking system. This commit included the basic menu, seat map, checking availability, booking seats, </w:t>
+      </w:r>
+      <w:proofErr w:type="gramStart"/>
+      <w:r>
+        <w:rPr>
+          <w:rFonts w:ascii="Arial" w:hAnsi="Arial" w:cs="Arial"/>
+          <w:sz w:val="18"/>
+          <w:szCs w:val="18"/>
+        </w:rPr>
+        <w:t>freeing</w:t>
+      </w:r>
+      <w:proofErr w:type="gramEnd"/>
+      <w:r>
+        <w:rPr>
+          <w:rFonts w:ascii="Arial" w:hAnsi="Arial" w:cs="Arial"/>
+          <w:sz w:val="18"/>
+          <w:szCs w:val="18"/>
+        </w:rPr>
+        <w:t xml:space="preserve"> seats, and showing the booking status.</w:t>
+      </w:r>
+    </w:p>
+    <w:p>
+      <w:pPr>
+        <w:rPr>
+          <w:rFonts w:ascii="Arial" w:hAnsi="Arial" w:cs="Arial"/>
+          <w:sz w:val="18"/>
+          <w:szCs w:val="18"/>
+        </w:rPr>
+      </w:pPr>
+      <w:r>
+        <w:rPr>
+          <w:rFonts w:ascii="Arial" w:hAnsi="Arial" w:cs="Arial"/>
+          <w:sz w:val="18"/>
+          <w:szCs w:val="18"/>
+        </w:rPr>
+        <w:t>After adding the extra airline functionality, I made another commit to show the new update. I also pushed the commits to GitHub so that the repository is publicly accessible online.</w:t>
+      </w:r>
+    </w:p>
+    <w:p>
+      <w:pPr>
+        <w:rPr>
+          <w:rFonts w:ascii="Arial" w:hAnsi="Arial" w:cs="Arial"/>
+          <w:sz w:val="18"/>
+          <w:szCs w:val="18"/>
+        </w:rPr>
+      </w:pPr>
+      <w:r>
+        <w:rPr>
+          <w:rFonts w:ascii="Arial" w:hAnsi="Arial" w:cs="Arial"/>
+          <w:sz w:val="18"/>
+          <w:szCs w:val="18"/>
+        </w:rPr>
+        <w:t xml:space="preserve">Repository link: </w:t>
+      </w:r>
+      <w:hyperlink r:id="rId5" w:history="1">
+        <w:r>
+          <w:rPr>
+            <w:rStyle w:val="Hyperlink"/>
+            <w:rFonts w:ascii="Arial" w:hAnsi="Arial" w:cs="Arial"/>
+            <w:sz w:val="18"/>
+            <w:szCs w:val="18"/>
+          </w:rPr>
+          <w:t>https://github.com/Sb3ai/FC7</w:t>
+        </w:r>
+        <w:r>
+          <w:rPr>
+            <w:rStyle w:val="Hyperlink"/>
+            <w:rFonts w:ascii="Arial" w:hAnsi="Arial" w:cs="Arial"/>
+            <w:sz w:val="18"/>
+            <w:szCs w:val="18"/>
+          </w:rPr>
+          <w:t>2</w:t>
+        </w:r>
+        <w:r>
+          <w:rPr>
+            <w:rStyle w:val="Hyperlink"/>
+            <w:rFonts w:ascii="Arial" w:hAnsi="Arial" w:cs="Arial"/>
+            <w:sz w:val="18"/>
+            <w:szCs w:val="18"/>
+          </w:rPr>
+          <w:t>3---</w:t>
+        </w:r>
+        <w:proofErr w:type="spellStart"/>
+        <w:r>
+          <w:rPr>
+            <w:rStyle w:val="Hyperlink"/>
+            <w:rFonts w:ascii="Arial" w:hAnsi="Arial" w:cs="Arial"/>
+            <w:sz w:val="18"/>
+            <w:szCs w:val="18"/>
+          </w:rPr>
+          <w:t>Final_Project.git</w:t>
+        </w:r>
+        <w:proofErr w:type="spellEnd"/>
+      </w:hyperlink>
+    </w:p>
+    <w:p>
+      <w:pPr>
+        <w:rPr>
+          <w:rFonts w:ascii="Arial" w:hAnsi="Arial" w:cs="Arial"/>
+          <w:sz w:val="18"/>
+          <w:szCs w:val="18"/>
+        </w:rPr>
+      </w:pPr>
+    </w:p>
+    <w:p>
+      <w:pPr>
+        <w:rPr>
+          <w:rFonts w:ascii="Arial" w:hAnsi="Arial" w:cs="Arial"/>
+          <w:sz w:val="18"/>
+          <w:szCs w:val="18"/>
+        </w:rPr>
+      </w:pPr>
       <w:r>
         <w:rPr>
           <w:rFonts w:ascii="Arial" w:hAnsi="Arial" w:cs="Arial"/>
@@ -552,6 +1002,14 @@
           <w:szCs w:val="18"/>
         </w:rPr>
         <w:br/>
+      </w:r>
+      <w:r>
+        <w:rPr>
+          <w:rFonts w:ascii="Arial" w:hAnsi="Arial" w:cs="Arial"/>
+          <w:sz w:val="18"/>
+          <w:szCs w:val="18"/>
+        </w:rPr>
+        <w:lastRenderedPageBreak/>
         <w:t>Part B: Refactored System with Booking References and Database</w:t>
       </w:r>
       <w:r>
@@ -1496,6 +1954,41 @@
       <w:spacing w:val="5"/>
     </w:rPr>
   </w:style>
+  <w:style w:type="character" w:styleId="Hyperlink">
+    <w:name w:val="Hyperlink"/>
+    <w:basedOn w:val="DefaultParagraphFont"/>
+    <w:uiPriority w:val="99"/>
+    <w:unhideWhenUsed/>
+    <w:rsid w:val="00D030B4"/>
+    <w:rPr>
+      <w:color w:val="467886" w:themeColor="hyperlink"/>
+      <w:u w:val="single"/>
+    </w:rPr>
+  </w:style>
+  <w:style w:type="character" w:styleId="UnresolvedMention">
+    <w:name w:val="Unresolved Mention"/>
+    <w:basedOn w:val="DefaultParagraphFont"/>
+    <w:uiPriority w:val="99"/>
+    <w:semiHidden/>
+    <w:unhideWhenUsed/>
+    <w:rsid w:val="00D030B4"/>
+    <w:rPr>
+      <w:color w:val="605E5C"/>
+      <w:shd w:val="clear" w:color="auto" w:fill="E1DFDD"/>
+    </w:rPr>
+  </w:style>
+  <w:style w:type="character" w:styleId="FollowedHyperlink">
+    <w:name w:val="FollowedHyperlink"/>
+    <w:basedOn w:val="DefaultParagraphFont"/>
+    <w:uiPriority w:val="99"/>
+    <w:semiHidden/>
+    <w:unhideWhenUsed/>
+    <w:rsid w:val="00D030B4"/>
+    <w:rPr>
+      <w:color w:val="96607D" w:themeColor="followedHyperlink"/>
+      <w:u w:val="single"/>
+    </w:rPr>
+  </w:style>
 </w:styles>
 </file>
 

</xml_diff>